<commit_message>
feat: aggiorna backend, frontend e documentazione di rilascio
</commit_message>
<xml_diff>
--- a/presentazione_progetto_modificato.docx
+++ b/presentazione_progetto_modificato.docx
@@ -7,7 +7,23 @@
         <w:pStyle w:val="Titolo1"/>
       </w:pPr>
       <w:r>
-        <w:t xml:space="preserve">Presentazione Progetto Aggiornato: LogiTrack - </w:t>
+        <w:t xml:space="preserve">Presentazione Progetto </w:t>
+      </w:r>
+      <w:proofErr w:type="spellStart"/>
+      <w:r>
+        <w:t>Aggiornato</w:t>
+      </w:r>
+      <w:proofErr w:type="spellEnd"/>
+      <w:r>
+        <w:t xml:space="preserve">: </w:t>
+      </w:r>
+      <w:proofErr w:type="spellStart"/>
+      <w:r>
+        <w:t>LogiTrack</w:t>
+      </w:r>
+      <w:proofErr w:type="spellEnd"/>
+      <w:r>
+        <w:t xml:space="preserve"> - </w:t>
       </w:r>
       <w:proofErr w:type="spellStart"/>
       <w:r>
@@ -339,15 +355,104 @@
     <w:p/>
     <w:p>
       <w:r>
-        <w:t>La fila più lunga scala a tutta larghezza disponibile; le altre sono proporzionali.</w:t>
+        <w:t xml:space="preserve">La fila più lunga scala a tutta larghezza disponibile; le </w:t>
+      </w:r>
+      <w:proofErr w:type="spellStart"/>
+      <w:r>
+        <w:t>altre</w:t>
+      </w:r>
+      <w:proofErr w:type="spellEnd"/>
+      <w:r>
+        <w:t xml:space="preserve"> </w:t>
+      </w:r>
+      <w:proofErr w:type="spellStart"/>
+      <w:r>
+        <w:t>sono</w:t>
+      </w:r>
+      <w:proofErr w:type="spellEnd"/>
+      <w:r>
+        <w:t xml:space="preserve"> </w:t>
+      </w:r>
+      <w:proofErr w:type="spellStart"/>
+      <w:r>
+        <w:t>proporzionali</w:t>
+      </w:r>
+      <w:proofErr w:type="spellEnd"/>
+      <w:r>
+        <w:t>.</w:t>
       </w:r>
     </w:p>
     <w:p/>
     <w:p>
       <w:pPr>
+        <w:keepNext/>
+      </w:pPr>
+      <w:r>
+        <w:drawing>
+          <wp:inline distT="0" distB="0" distL="0" distR="0" wp14:anchorId="2231F809" wp14:editId="5D9F00A5">
+            <wp:extent cx="5486400" cy="2516505"/>
+            <wp:effectExtent l="0" t="0" r="0" b="0"/>
+            <wp:docPr id="930573986" name="Immagine 1" descr="Immagine che contiene schermata, testo, Rettangolo, Policromia&#10;&#10;Il contenuto generato dall'IA potrebbe non essere corretto."/>
+            <wp:cNvGraphicFramePr>
+              <a:graphicFrameLocks xmlns:a="http://schemas.openxmlformats.org/drawingml/2006/main" noChangeAspect="1"/>
+            </wp:cNvGraphicFramePr>
+            <a:graphic xmlns:a="http://schemas.openxmlformats.org/drawingml/2006/main">
+              <a:graphicData uri="http://schemas.openxmlformats.org/drawingml/2006/picture">
+                <pic:pic xmlns:pic="http://schemas.openxmlformats.org/drawingml/2006/picture">
+                  <pic:nvPicPr>
+                    <pic:cNvPr id="930573986" name="Immagine 1" descr="Immagine che contiene schermata, testo, Rettangolo, Policromia&#10;&#10;Il contenuto generato dall'IA potrebbe non essere corretto."/>
+                    <pic:cNvPicPr/>
+                  </pic:nvPicPr>
+                  <pic:blipFill>
+                    <a:blip r:embed="rId6"/>
+                    <a:stretch>
+                      <a:fillRect/>
+                    </a:stretch>
+                  </pic:blipFill>
+                  <pic:spPr>
+                    <a:xfrm>
+                      <a:off x="0" y="0"/>
+                      <a:ext cx="5486400" cy="2516505"/>
+                    </a:xfrm>
+                    <a:prstGeom prst="rect">
+                      <a:avLst/>
+                    </a:prstGeom>
+                  </pic:spPr>
+                </pic:pic>
+              </a:graphicData>
+            </a:graphic>
+          </wp:inline>
+        </w:drawing>
+      </w:r>
+    </w:p>
+    <w:p>
+      <w:pPr>
+        <w:pStyle w:val="Didascalia"/>
+      </w:pPr>
+      <w:proofErr w:type="spellStart"/>
+      <w:r>
+        <w:t>Esempio</w:t>
+      </w:r>
+      <w:proofErr w:type="spellEnd"/>
+      <w:r>
+        <w:t xml:space="preserve"> della </w:t>
+      </w:r>
+      <w:proofErr w:type="spellStart"/>
+      <w:r>
+        <w:t>gestione</w:t>
+      </w:r>
+      <w:proofErr w:type="spellEnd"/>
+      <w:r>
+        <w:t xml:space="preserve"> VASCHE</w:t>
+      </w:r>
+    </w:p>
+    <w:p/>
+    <w:p>
+      <w:pPr>
         <w:pStyle w:val="Titolo2"/>
       </w:pPr>
       <w:r>
+        <w:lastRenderedPageBreak/>
         <w:t>4.4 Nuovo Modello Operativo "Solette"</w:t>
       </w:r>
     </w:p>
@@ -424,7 +529,6 @@
         <w:pStyle w:val="Puntoelenco"/>
       </w:pPr>
       <w:r>
-        <w:lastRenderedPageBreak/>
         <w:t>Dopo ogni movimentazione, i livelli sono ricompattati automaticamente (`L1..Ln`).</w:t>
       </w:r>
     </w:p>
@@ -488,14 +592,97 @@
         <w:t>Questo flusso riduce errori e rende il processo allineato alla realtà operativa di piazzale.</w:t>
       </w:r>
     </w:p>
+    <w:p>
+      <w:pPr>
+        <w:keepNext/>
+      </w:pPr>
+      <w:r>
+        <w:drawing>
+          <wp:inline distT="0" distB="0" distL="0" distR="0" wp14:anchorId="210B1C64" wp14:editId="3A24FF8A">
+            <wp:extent cx="5486400" cy="1459865"/>
+            <wp:effectExtent l="0" t="0" r="0" b="6985"/>
+            <wp:docPr id="1240735229" name="Immagine 1" descr="Immagine che contiene testo, schermata, Diagramma, linea&#10;&#10;Il contenuto generato dall'IA potrebbe non essere corretto."/>
+            <wp:cNvGraphicFramePr>
+              <a:graphicFrameLocks xmlns:a="http://schemas.openxmlformats.org/drawingml/2006/main" noChangeAspect="1"/>
+            </wp:cNvGraphicFramePr>
+            <a:graphic xmlns:a="http://schemas.openxmlformats.org/drawingml/2006/main">
+              <a:graphicData uri="http://schemas.openxmlformats.org/drawingml/2006/picture">
+                <pic:pic xmlns:pic="http://schemas.openxmlformats.org/drawingml/2006/picture">
+                  <pic:nvPicPr>
+                    <pic:cNvPr id="1240735229" name="Immagine 1" descr="Immagine che contiene testo, schermata, Diagramma, linea&#10;&#10;Il contenuto generato dall'IA potrebbe non essere corretto."/>
+                    <pic:cNvPicPr/>
+                  </pic:nvPicPr>
+                  <pic:blipFill>
+                    <a:blip r:embed="rId7"/>
+                    <a:stretch>
+                      <a:fillRect/>
+                    </a:stretch>
+                  </pic:blipFill>
+                  <pic:spPr>
+                    <a:xfrm>
+                      <a:off x="0" y="0"/>
+                      <a:ext cx="5486400" cy="1459865"/>
+                    </a:xfrm>
+                    <a:prstGeom prst="rect">
+                      <a:avLst/>
+                    </a:prstGeom>
+                  </pic:spPr>
+                </pic:pic>
+              </a:graphicData>
+            </a:graphic>
+          </wp:inline>
+        </w:drawing>
+      </w:r>
+    </w:p>
+    <w:p>
+      <w:pPr>
+        <w:pStyle w:val="Didascalia"/>
+      </w:pPr>
+      <w:proofErr w:type="spellStart"/>
+      <w:r>
+        <w:t>Esempio</w:t>
+      </w:r>
+      <w:proofErr w:type="spellEnd"/>
+      <w:r>
+        <w:t xml:space="preserve"> della </w:t>
+      </w:r>
+      <w:proofErr w:type="spellStart"/>
+      <w:r>
+        <w:t>gestione</w:t>
+      </w:r>
+      <w:proofErr w:type="spellEnd"/>
+      <w:r>
+        <w:t xml:space="preserve"> SOLETT</w:t>
+      </w:r>
+      <w:r>
+        <w:t>E</w:t>
+      </w:r>
+    </w:p>
     <w:p/>
     <w:p>
       <w:pPr>
         <w:pStyle w:val="Titolo2"/>
       </w:pPr>
       <w:r>
-        <w:t>5. Funzionalità Principali Disponibili Oggi</w:t>
+        <w:lastRenderedPageBreak/>
+        <w:t xml:space="preserve">5. </w:t>
       </w:r>
+      <w:proofErr w:type="spellStart"/>
+      <w:r>
+        <w:t>Funzionalità</w:t>
+      </w:r>
+      <w:proofErr w:type="spellEnd"/>
+      <w:r>
+        <w:t xml:space="preserve"> </w:t>
+      </w:r>
+      <w:r>
+        <w:t xml:space="preserve">da </w:t>
+      </w:r>
+      <w:proofErr w:type="spellStart"/>
+      <w:r>
+        <w:t>sviluppare</w:t>
+      </w:r>
+      <w:proofErr w:type="spellEnd"/>
     </w:p>
     <w:p>
       <w:pPr>
@@ -648,8 +835,31 @@
     <w:p/>
     <w:p>
       <w:r>
-        <w:lastRenderedPageBreak/>
-        <w:t xml:space="preserve">Il sistema attuale non è solo una visualizzazione della planimetria, ma uno strumento decisionale e di controllo delle movimentazioni, con particolare attenzione alla nuova logica di gestione delle </w:t>
+        <w:t xml:space="preserve">Il </w:t>
+      </w:r>
+      <w:proofErr w:type="spellStart"/>
+      <w:r>
+        <w:t>sistema</w:t>
+      </w:r>
+      <w:proofErr w:type="spellEnd"/>
+      <w:r>
+        <w:t xml:space="preserve"> </w:t>
+      </w:r>
+      <w:proofErr w:type="spellStart"/>
+      <w:r>
+        <w:t>progettato</w:t>
+      </w:r>
+      <w:proofErr w:type="spellEnd"/>
+      <w:r>
+        <w:t xml:space="preserve"> non è solo una visualizzazione della planimetria, ma uno strumento decisionale e di controllo delle movimentazioni, con particolare attenzione alla nuova logica di </w:t>
+      </w:r>
+      <w:proofErr w:type="spellStart"/>
+      <w:r>
+        <w:t>gestione</w:t>
+      </w:r>
+      <w:proofErr w:type="spellEnd"/>
+      <w:r>
+        <w:t xml:space="preserve"> delle </w:t>
       </w:r>
       <w:proofErr w:type="spellStart"/>
       <w:r>
@@ -2049,7 +2259,6 @@
     <w:basedOn w:val="Normale"/>
     <w:next w:val="Normale"/>
     <w:uiPriority w:val="35"/>
-    <w:semiHidden/>
     <w:unhideWhenUsed/>
     <w:qFormat/>
     <w:rsid w:val="00FC693F"/>

</xml_diff>